<commit_message>
Aggiunte Foto al popolamento
</commit_message>
<xml_diff>
--- a/Documentazione.docx
+++ b/Documentazione.docx
@@ -1,6 +1,6 @@
 
 <file path=word/document.xml><?xml version="1.0" encoding="utf-8"?>
-<w:document xmlns:wpc="http://schemas.microsoft.com/office/word/2010/wordprocessingCanvas" xmlns:cx="http://schemas.microsoft.com/office/drawing/2014/chartex" xmlns:cx1="http://schemas.microsoft.com/office/drawing/2015/9/8/chartex" xmlns:cx2="http://schemas.microsoft.com/office/drawing/2015/10/21/chartex" xmlns:cx3="http://schemas.microsoft.com/office/drawing/2016/5/9/chartex" xmlns:cx4="http://schemas.microsoft.com/office/drawing/2016/5/10/chartex" xmlns:cx5="http://schemas.microsoft.com/office/drawing/2016/5/11/chartex" xmlns:cx6="http://schemas.microsoft.com/office/drawing/2016/5/12/chartex" xmlns:cx7="http://schemas.microsoft.com/office/drawing/2016/5/13/chartex" xmlns:cx8="http://schemas.microsoft.com/office/drawing/2016/5/14/chartex" xmlns:mc="http://schemas.openxmlformats.org/markup-compatibility/2006" xmlns:aink="http://schemas.microsoft.com/office/drawing/2016/ink" xmlns:am3d="http://schemas.microsoft.com/office/drawing/2017/model3d" xmlns:o="urn:schemas-microsoft-com:office:office" xmlns:oel="http://schemas.microsoft.com/office/2019/extlst" xmlns:r="http://schemas.openxmlformats.org/officeDocument/2006/relationships" xmlns:m="http://schemas.openxmlformats.org/officeDocument/2006/math" xmlns:v="urn:schemas-microsoft-com:vml" xmlns:wp14="http://schemas.microsoft.com/office/word/2010/wordprocessingDrawing" xmlns:wp="http://schemas.openxmlformats.org/drawingml/2006/wordprocessingDrawing" xmlns:w10="urn:schemas-microsoft-com:office:word" xmlns:w="http://schemas.openxmlformats.org/wordprocessingml/2006/main" xmlns:w14="http://schemas.microsoft.com/office/word/2010/wordml" xmlns:w15="http://schemas.microsoft.com/office/word/2012/wordml" xmlns:w16cex="http://schemas.microsoft.com/office/word/2018/wordml/cex" xmlns:w16cid="http://schemas.microsoft.com/office/word/2016/wordml/cid" xmlns:w16="http://schemas.microsoft.com/office/word/2018/wordml" xmlns:w16du="http://schemas.microsoft.com/office/word/2023/wordml/word16du" xmlns:w16sdtdh="http://schemas.microsoft.com/office/word/2020/wordml/sdtdatahash" xmlns:w16sdtfl="http://schemas.microsoft.com/office/word/2024/wordml/sdtformatlock" xmlns:w16se="http://schemas.microsoft.com/office/word/2015/wordml/symex" xmlns:wpg="http://schemas.microsoft.com/office/word/2010/wordprocessingGroup" xmlns:wpi="http://schemas.microsoft.com/office/word/2010/wordprocessingInk" xmlns:wne="http://schemas.microsoft.com/office/word/2006/wordml" xmlns:wps="http://schemas.microsoft.com/office/word/2010/wordprocessingShape" mc:Ignorable="w14 w15 w16se w16cid w16 w16cex w16sdtdh w16sdtfl w16du wp14">
+<w:document xmlns:wpc="http://schemas.microsoft.com/office/word/2010/wordprocessingCanvas" xmlns:cx="http://schemas.microsoft.com/office/drawing/2014/chartex" xmlns:cx1="http://schemas.microsoft.com/office/drawing/2015/9/8/chartex" xmlns:cx2="http://schemas.microsoft.com/office/drawing/2015/10/21/chartex" xmlns:cx3="http://schemas.microsoft.com/office/drawing/2016/5/9/chartex" xmlns:cx4="http://schemas.microsoft.com/office/drawing/2016/5/10/chartex" xmlns:cx5="http://schemas.microsoft.com/office/drawing/2016/5/11/chartex" xmlns:cx6="http://schemas.microsoft.com/office/drawing/2016/5/12/chartex" xmlns:cx7="http://schemas.microsoft.com/office/drawing/2016/5/13/chartex" xmlns:cx8="http://schemas.microsoft.com/office/drawing/2016/5/14/chartex" xmlns:mc="http://schemas.openxmlformats.org/markup-compatibility/2006" xmlns:aink="http://schemas.microsoft.com/office/drawing/2016/ink" xmlns:am3d="http://schemas.microsoft.com/office/drawing/2017/model3d" xmlns:o="urn:schemas-microsoft-com:office:office" xmlns:r="http://schemas.openxmlformats.org/officeDocument/2006/relationships" xmlns:m="http://schemas.openxmlformats.org/officeDocument/2006/math" xmlns:v="urn:schemas-microsoft-com:vml" xmlns:wp14="http://schemas.microsoft.com/office/word/2010/wordprocessingDrawing" xmlns:wp="http://schemas.openxmlformats.org/drawingml/2006/wordprocessingDrawing" xmlns:w10="urn:schemas-microsoft-com:office:word" xmlns:w="http://schemas.openxmlformats.org/wordprocessingml/2006/main" xmlns:w14="http://schemas.microsoft.com/office/word/2010/wordml" xmlns:w15="http://schemas.microsoft.com/office/word/2012/wordml" xmlns:w16cid="http://schemas.microsoft.com/office/word/2016/wordml/cid" xmlns:w16se="http://schemas.microsoft.com/office/word/2015/wordml/symex" xmlns:wpg="http://schemas.microsoft.com/office/word/2010/wordprocessingGroup" xmlns:wpi="http://schemas.microsoft.com/office/word/2010/wordprocessingInk" xmlns:wne="http://schemas.microsoft.com/office/word/2006/wordml" xmlns:wps="http://schemas.microsoft.com/office/word/2010/wordprocessingShape" mc:Ignorable="w14 w15 w16se w16cid wp14">
   <w:body>
     <w:p>
       <w:pPr>
@@ -452,6 +452,8 @@
             </w:pPr>
           </w:p>
         </w:tc>
+        <w:bookmarkStart w:id="0" w:name="_GoBack"/>
+        <w:bookmarkEnd w:id="0"/>
       </w:tr>
       <w:tr>
         <w:tc>
@@ -484,6 +486,18 @@
                 <w:lang w:eastAsia="it-IT"/>
               </w:rPr>
             </w:pPr>
+            <w:r>
+              <w:rPr>
+                <w:rFonts w:ascii="Times New Roman" w:eastAsia="Times New Roman" w:hAnsi="Times New Roman" w:cs="Times New Roman"/>
+                <w:b/>
+                <w:bCs/>
+                <w:color w:val="000000" w:themeColor="text1"/>
+                <w:sz w:val="24"/>
+                <w:szCs w:val="24"/>
+                <w:lang w:eastAsia="it-IT"/>
+              </w:rPr>
+              <w:t>291672</w:t>
+            </w:r>
           </w:p>
         </w:tc>
         <w:tc>
@@ -730,15 +744,27 @@
           <w:lang w:eastAsia="it-IT"/>
         </w:rPr>
       </w:pPr>
-      <w:r>
-        <w:rPr>
-          <w:rFonts w:ascii="Segoe UI" w:eastAsia="Times New Roman" w:hAnsi="Segoe UI" w:cs="Segoe UI"/>
-          <w:color w:val="000000" w:themeColor="text1"/>
-          <w:sz w:val="24"/>
-          <w:szCs w:val="24"/>
-          <w:lang w:eastAsia="it-IT"/>
-        </w:rPr>
-        <w:t>E' possibile riportare in questa sezione i **requisiti **copiati dal documento di specifica, oppure semplicemente riassumerne gli aspetti più importanti. Vanno quindi (eventualmente) discusse tutte le scelte progettuali relative al dominio, le ambiguità e il modo in cui sono state risolte.</w:t>
+      <w:proofErr w:type="gramStart"/>
+      <w:r>
+        <w:rPr>
+          <w:rFonts w:ascii="Segoe UI" w:eastAsia="Times New Roman" w:hAnsi="Segoe UI" w:cs="Segoe UI"/>
+          <w:color w:val="000000" w:themeColor="text1"/>
+          <w:sz w:val="24"/>
+          <w:szCs w:val="24"/>
+          <w:lang w:eastAsia="it-IT"/>
+        </w:rPr>
+        <w:t>E'</w:t>
+      </w:r>
+      <w:proofErr w:type="gramEnd"/>
+      <w:r>
+        <w:rPr>
+          <w:rFonts w:ascii="Segoe UI" w:eastAsia="Times New Roman" w:hAnsi="Segoe UI" w:cs="Segoe UI"/>
+          <w:color w:val="000000" w:themeColor="text1"/>
+          <w:sz w:val="24"/>
+          <w:szCs w:val="24"/>
+          <w:lang w:eastAsia="it-IT"/>
+        </w:rPr>
+        <w:t xml:space="preserve"> possibile riportare in questa sezione i **requisiti **copiati dal documento di specifica, oppure semplicemente riassumerne gli aspetti più importanti. Vanno quindi (eventualmente) discusse tutte le scelte progettuali relative al dominio, le ambiguità e il modo in cui sono state risolte.</w:t>
       </w:r>
     </w:p>
     <w:p>
@@ -756,15 +782,27 @@
           <w:lang w:eastAsia="it-IT"/>
         </w:rPr>
       </w:pPr>
-      <w:r>
-        <w:rPr>
-          <w:rFonts w:ascii="Segoe UI" w:eastAsia="Times New Roman" w:hAnsi="Segoe UI" w:cs="Segoe UI"/>
-          <w:color w:val="000000" w:themeColor="text1"/>
-          <w:sz w:val="24"/>
-          <w:szCs w:val="24"/>
-          <w:lang w:eastAsia="it-IT"/>
-        </w:rPr>
-        <w:t>E' possibile infine inserire qui un glossario che riporta tutti gli oggetti di dominio individuati, con la loro semantica, i loro eventuali sinonimi e le loro proprietà.</w:t>
+      <w:proofErr w:type="gramStart"/>
+      <w:r>
+        <w:rPr>
+          <w:rFonts w:ascii="Segoe UI" w:eastAsia="Times New Roman" w:hAnsi="Segoe UI" w:cs="Segoe UI"/>
+          <w:color w:val="000000" w:themeColor="text1"/>
+          <w:sz w:val="24"/>
+          <w:szCs w:val="24"/>
+          <w:lang w:eastAsia="it-IT"/>
+        </w:rPr>
+        <w:t>E'</w:t>
+      </w:r>
+      <w:proofErr w:type="gramEnd"/>
+      <w:r>
+        <w:rPr>
+          <w:rFonts w:ascii="Segoe UI" w:eastAsia="Times New Roman" w:hAnsi="Segoe UI" w:cs="Segoe UI"/>
+          <w:color w:val="000000" w:themeColor="text1"/>
+          <w:sz w:val="24"/>
+          <w:szCs w:val="24"/>
+          <w:lang w:eastAsia="it-IT"/>
+        </w:rPr>
+        <w:t xml:space="preserve"> possibile infine inserire qui un glossario che riporta tutti gli oggetti di dominio individuati, con la loro semantica, i loro eventuali sinonimi e le loro proprietà.</w:t>
       </w:r>
     </w:p>
     <w:p>
@@ -1342,7 +1380,29 @@
           <w:szCs w:val="24"/>
           <w:lang w:eastAsia="it-IT"/>
         </w:rPr>
-        <w:t>Potete opzionalmente fornire anche uno script separato di popolamento (INSERT) del database su cui basare i test delle query descritte nella sezione successiva.</w:t>
+        <w:t xml:space="preserve">Potete opzionalmente fornire anche uno script separato di popolamento (INSERT) del database su cui basare i test delle </w:t>
+      </w:r>
+      <w:proofErr w:type="spellStart"/>
+      <w:r>
+        <w:rPr>
+          <w:rFonts w:ascii="Segoe UI" w:eastAsia="Times New Roman" w:hAnsi="Segoe UI" w:cs="Segoe UI"/>
+          <w:color w:val="000000" w:themeColor="text1"/>
+          <w:sz w:val="24"/>
+          <w:szCs w:val="24"/>
+          <w:lang w:eastAsia="it-IT"/>
+        </w:rPr>
+        <w:t>query</w:t>
+      </w:r>
+      <w:proofErr w:type="spellEnd"/>
+      <w:r>
+        <w:rPr>
+          <w:rFonts w:ascii="Segoe UI" w:eastAsia="Times New Roman" w:hAnsi="Segoe UI" w:cs="Segoe UI"/>
+          <w:color w:val="000000" w:themeColor="text1"/>
+          <w:sz w:val="24"/>
+          <w:szCs w:val="24"/>
+          <w:lang w:eastAsia="it-IT"/>
+        </w:rPr>
+        <w:t xml:space="preserve"> descritte nella sezione successiva.</w:t>
       </w:r>
     </w:p>
     <w:p>
@@ -1794,7 +1854,29 @@
           <w:szCs w:val="24"/>
           <w:lang w:eastAsia="it-IT"/>
         </w:rPr>
-        <w:t> (a linea di comando o grafica) in un linguaggio di programmazione a voi noto (Java, PHP, ...) che manipoli il vostro database , dichiaratelo in questa sezione, elencando le tecnologie utilizzate e le funzionalità invocabili dall'interfaccia.</w:t>
+        <w:t xml:space="preserve"> (a linea di comando o grafica) in un linguaggio di programmazione a voi noto (Java, PHP, ...) che manipoli il vostro </w:t>
+      </w:r>
+      <w:proofErr w:type="gramStart"/>
+      <w:r>
+        <w:rPr>
+          <w:rFonts w:ascii="Segoe UI" w:eastAsia="Times New Roman" w:hAnsi="Segoe UI" w:cs="Segoe UI"/>
+          <w:color w:val="000000" w:themeColor="text1"/>
+          <w:sz w:val="24"/>
+          <w:szCs w:val="24"/>
+          <w:lang w:eastAsia="it-IT"/>
+        </w:rPr>
+        <w:t>database ,</w:t>
+      </w:r>
+      <w:proofErr w:type="gramEnd"/>
+      <w:r>
+        <w:rPr>
+          <w:rFonts w:ascii="Segoe UI" w:eastAsia="Times New Roman" w:hAnsi="Segoe UI" w:cs="Segoe UI"/>
+          <w:color w:val="000000" w:themeColor="text1"/>
+          <w:sz w:val="24"/>
+          <w:szCs w:val="24"/>
+          <w:lang w:eastAsia="it-IT"/>
+        </w:rPr>
+        <w:t xml:space="preserve"> dichiaratelo in questa sezione, elencando le tecnologie utilizzate e le funzionalità invocabili dall'interfaccia.</w:t>
       </w:r>
     </w:p>
     <w:p>
@@ -1841,7 +1923,7 @@
 </file>
 
 <file path=word/numbering.xml><?xml version="1.0" encoding="utf-8"?>
-<w:numbering xmlns:wpc="http://schemas.microsoft.com/office/word/2010/wordprocessingCanvas" xmlns:cx="http://schemas.microsoft.com/office/drawing/2014/chartex" xmlns:cx1="http://schemas.microsoft.com/office/drawing/2015/9/8/chartex" xmlns:cx2="http://schemas.microsoft.com/office/drawing/2015/10/21/chartex" xmlns:cx3="http://schemas.microsoft.com/office/drawing/2016/5/9/chartex" xmlns:cx4="http://schemas.microsoft.com/office/drawing/2016/5/10/chartex" xmlns:cx5="http://schemas.microsoft.com/office/drawing/2016/5/11/chartex" xmlns:cx6="http://schemas.microsoft.com/office/drawing/2016/5/12/chartex" xmlns:cx7="http://schemas.microsoft.com/office/drawing/2016/5/13/chartex" xmlns:cx8="http://schemas.microsoft.com/office/drawing/2016/5/14/chartex" xmlns:mc="http://schemas.openxmlformats.org/markup-compatibility/2006" xmlns:aink="http://schemas.microsoft.com/office/drawing/2016/ink" xmlns:am3d="http://schemas.microsoft.com/office/drawing/2017/model3d" xmlns:o="urn:schemas-microsoft-com:office:office" xmlns:oel="http://schemas.microsoft.com/office/2019/extlst" xmlns:r="http://schemas.openxmlformats.org/officeDocument/2006/relationships" xmlns:m="http://schemas.openxmlformats.org/officeDocument/2006/math" xmlns:v="urn:schemas-microsoft-com:vml" xmlns:wp14="http://schemas.microsoft.com/office/word/2010/wordprocessingDrawing" xmlns:wp="http://schemas.openxmlformats.org/drawingml/2006/wordprocessingDrawing" xmlns:w10="urn:schemas-microsoft-com:office:word" xmlns:w="http://schemas.openxmlformats.org/wordprocessingml/2006/main" xmlns:w14="http://schemas.microsoft.com/office/word/2010/wordml" xmlns:w15="http://schemas.microsoft.com/office/word/2012/wordml" xmlns:w16cex="http://schemas.microsoft.com/office/word/2018/wordml/cex" xmlns:w16cid="http://schemas.microsoft.com/office/word/2016/wordml/cid" xmlns:w16="http://schemas.microsoft.com/office/word/2018/wordml" xmlns:w16du="http://schemas.microsoft.com/office/word/2023/wordml/word16du" xmlns:w16sdtdh="http://schemas.microsoft.com/office/word/2020/wordml/sdtdatahash" xmlns:w16sdtfl="http://schemas.microsoft.com/office/word/2024/wordml/sdtformatlock" xmlns:w16se="http://schemas.microsoft.com/office/word/2015/wordml/symex" xmlns:wpg="http://schemas.microsoft.com/office/word/2010/wordprocessingGroup" xmlns:wpi="http://schemas.microsoft.com/office/word/2010/wordprocessingInk" xmlns:wne="http://schemas.microsoft.com/office/word/2006/wordml" xmlns:wps="http://schemas.microsoft.com/office/word/2010/wordprocessingShape" mc:Ignorable="w14 w15 w16se w16cid w16 w16cex w16sdtdh w16sdtfl w16du wp14">
+<w:numbering xmlns:wpc="http://schemas.microsoft.com/office/word/2010/wordprocessingCanvas" xmlns:cx="http://schemas.microsoft.com/office/drawing/2014/chartex" xmlns:cx1="http://schemas.microsoft.com/office/drawing/2015/9/8/chartex" xmlns:cx2="http://schemas.microsoft.com/office/drawing/2015/10/21/chartex" xmlns:cx3="http://schemas.microsoft.com/office/drawing/2016/5/9/chartex" xmlns:cx4="http://schemas.microsoft.com/office/drawing/2016/5/10/chartex" xmlns:cx5="http://schemas.microsoft.com/office/drawing/2016/5/11/chartex" xmlns:cx6="http://schemas.microsoft.com/office/drawing/2016/5/12/chartex" xmlns:cx7="http://schemas.microsoft.com/office/drawing/2016/5/13/chartex" xmlns:cx8="http://schemas.microsoft.com/office/drawing/2016/5/14/chartex" xmlns:mc="http://schemas.openxmlformats.org/markup-compatibility/2006" xmlns:aink="http://schemas.microsoft.com/office/drawing/2016/ink" xmlns:am3d="http://schemas.microsoft.com/office/drawing/2017/model3d" xmlns:o="urn:schemas-microsoft-com:office:office" xmlns:r="http://schemas.openxmlformats.org/officeDocument/2006/relationships" xmlns:m="http://schemas.openxmlformats.org/officeDocument/2006/math" xmlns:v="urn:schemas-microsoft-com:vml" xmlns:wp14="http://schemas.microsoft.com/office/word/2010/wordprocessingDrawing" xmlns:wp="http://schemas.openxmlformats.org/drawingml/2006/wordprocessingDrawing" xmlns:w10="urn:schemas-microsoft-com:office:word" xmlns:w="http://schemas.openxmlformats.org/wordprocessingml/2006/main" xmlns:w14="http://schemas.microsoft.com/office/word/2010/wordml" xmlns:w15="http://schemas.microsoft.com/office/word/2012/wordml" xmlns:w16cid="http://schemas.microsoft.com/office/word/2016/wordml/cid" xmlns:w16se="http://schemas.microsoft.com/office/word/2015/wordml/symex" xmlns:wpg="http://schemas.microsoft.com/office/word/2010/wordprocessingGroup" xmlns:wpi="http://schemas.microsoft.com/office/word/2010/wordprocessingInk" xmlns:wne="http://schemas.microsoft.com/office/word/2006/wordml" xmlns:wps="http://schemas.microsoft.com/office/word/2010/wordprocessingShape" mc:Ignorable="w14 w15 w16se w16cid wp14">
   <w:abstractNum w:abstractNumId="0" w15:restartNumberingAfterBreak="0">
     <w:nsid w:val="0E080B6E"/>
     <w:multiLevelType w:val="multilevel"/>
@@ -3183,38 +3265,38 @@
       </w:rPr>
     </w:lvl>
   </w:abstractNum>
-  <w:num w:numId="1" w16cid:durableId="369300989">
+  <w:num w:numId="1">
     <w:abstractNumId w:val="8"/>
   </w:num>
-  <w:num w:numId="2" w16cid:durableId="850686770">
+  <w:num w:numId="2">
     <w:abstractNumId w:val="5"/>
   </w:num>
-  <w:num w:numId="3" w16cid:durableId="348216183">
+  <w:num w:numId="3">
     <w:abstractNumId w:val="2"/>
   </w:num>
-  <w:num w:numId="4" w16cid:durableId="1741709907">
+  <w:num w:numId="4">
     <w:abstractNumId w:val="6"/>
   </w:num>
-  <w:num w:numId="5" w16cid:durableId="1095827932">
+  <w:num w:numId="5">
     <w:abstractNumId w:val="4"/>
   </w:num>
-  <w:num w:numId="6" w16cid:durableId="1606385482">
+  <w:num w:numId="6">
     <w:abstractNumId w:val="7"/>
   </w:num>
-  <w:num w:numId="7" w16cid:durableId="1028412468">
+  <w:num w:numId="7">
     <w:abstractNumId w:val="1"/>
   </w:num>
-  <w:num w:numId="8" w16cid:durableId="1868911300">
+  <w:num w:numId="8">
     <w:abstractNumId w:val="3"/>
   </w:num>
-  <w:num w:numId="9" w16cid:durableId="508835106">
+  <w:num w:numId="9">
     <w:abstractNumId w:val="0"/>
   </w:num>
 </w:numbering>
 </file>
 
 <file path=word/styles.xml><?xml version="1.0" encoding="utf-8"?>
-<w:styles xmlns:mc="http://schemas.openxmlformats.org/markup-compatibility/2006" xmlns:r="http://schemas.openxmlformats.org/officeDocument/2006/relationships" xmlns:w="http://schemas.openxmlformats.org/wordprocessingml/2006/main" xmlns:w14="http://schemas.microsoft.com/office/word/2010/wordml" xmlns:w15="http://schemas.microsoft.com/office/word/2012/wordml" xmlns:w16cex="http://schemas.microsoft.com/office/word/2018/wordml/cex" xmlns:w16cid="http://schemas.microsoft.com/office/word/2016/wordml/cid" xmlns:w16="http://schemas.microsoft.com/office/word/2018/wordml" xmlns:w16du="http://schemas.microsoft.com/office/word/2023/wordml/word16du" xmlns:w16sdtdh="http://schemas.microsoft.com/office/word/2020/wordml/sdtdatahash" xmlns:w16sdtfl="http://schemas.microsoft.com/office/word/2024/wordml/sdtformatlock" xmlns:w16se="http://schemas.microsoft.com/office/word/2015/wordml/symex" mc:Ignorable="w14 w15 w16se w16cid w16 w16cex w16sdtdh w16sdtfl w16du">
+<w:styles xmlns:mc="http://schemas.openxmlformats.org/markup-compatibility/2006" xmlns:r="http://schemas.openxmlformats.org/officeDocument/2006/relationships" xmlns:w="http://schemas.openxmlformats.org/wordprocessingml/2006/main" xmlns:w14="http://schemas.microsoft.com/office/word/2010/wordml" xmlns:w15="http://schemas.microsoft.com/office/word/2012/wordml" xmlns:w16cid="http://schemas.microsoft.com/office/word/2016/wordml/cid" xmlns:w16se="http://schemas.microsoft.com/office/word/2015/wordml/symex" mc:Ignorable="w14 w15 w16se w16cid">
   <w:docDefaults>
     <w:rPrDefault>
       <w:rPr>
@@ -3230,7 +3312,7 @@
       </w:pPr>
     </w:pPrDefault>
   </w:docDefaults>
-  <w:latentStyles w:defLockedState="0" w:defUIPriority="99" w:defSemiHidden="0" w:defUnhideWhenUsed="0" w:defQFormat="0" w:count="376">
+  <w:latentStyles w:defLockedState="0" w:defUIPriority="99" w:defSemiHidden="0" w:defUnhideWhenUsed="0" w:defQFormat="0" w:count="375">
     <w:lsdException w:name="Normal" w:uiPriority="0" w:qFormat="1"/>
     <w:lsdException w:name="heading 1" w:uiPriority="9" w:qFormat="1"/>
     <w:lsdException w:name="heading 2" w:semiHidden="1" w:uiPriority="9" w:unhideWhenUsed="1" w:qFormat="1"/>
@@ -3606,7 +3688,6 @@
     <w:lsdException w:name="Smart Hyperlink" w:semiHidden="1" w:unhideWhenUsed="1"/>
     <w:lsdException w:name="Hashtag" w:semiHidden="1" w:unhideWhenUsed="1"/>
     <w:lsdException w:name="Unresolved Mention" w:semiHidden="1" w:unhideWhenUsed="1"/>
-    <w:lsdException w:name="Smart Link" w:semiHidden="1" w:unhideWhenUsed="1"/>
   </w:latentStyles>
   <w:style w:type="paragraph" w:default="1" w:styleId="Normale">
     <w:name w:val="Normal"/>

</xml_diff>